<commit_message>
Address final reviewer audit corrections
</commit_message>
<xml_diff>
--- a/revision1/FINAL_minimal/PeerJ_upload/cs-134580-Table1.docx
+++ b/revision1/FINAL_minimal/PeerJ_upload/cs-134580-Table1.docx
@@ -1516,7 +1516,7 @@
                 <w:b w:val="0"/>
                 <w:sz w:val="18"/>
               </w:rPr>
-              <w:t>-0.0026 [-0.0041, -0.0011]</w:t>
+              <w:t>-0.00262 [-0.00410, -0.00114]</w:t>
             </w:r>
           </w:p>
         </w:tc>
@@ -1666,7 +1666,7 @@
                 <w:b w:val="0"/>
                 <w:sz w:val="18"/>
               </w:rPr>
-              <w:t>-0.0026 [-0.0041, -0.0011]</w:t>
+              <w:t>-0.00263 [-0.00415, -0.00110]</w:t>
             </w:r>
           </w:p>
         </w:tc>

</xml_diff>